<commit_message>
docs: pertegas batasan TA vs O-RAN mTLS (Bab I.4) + related work & pembedaan (Bab II.1) + 9 referensi baru
</commit_message>
<xml_diff>
--- a/docs/Proyek_Akhir_ZTA_Draft.docx
+++ b/docs/Proyek_Akhir_ZTA_Draft.docx
@@ -484,6 +484,12 @@
           <w:sz w:val="24"/>
         </w:rPr>
         <w:t>4. Konteks sektor finansial Indonesia digunakan sebagai studi kasus pustaka, bukan sebagai obyek pengujian langsung.</w:t>
+      </w:r>
+    </w:p>
+    <w:p>
+      <w:pPr/>
+      <w:r>
+        <w:t>5. Penelitian ini secara tegas dibedakan dari studi Zero-Trust berbasis mTLS pada management plane O-RAN (antarmuka O1/O2/A1) yang berfokus pada penegakan identitas per-akses di domain telekomunikasi. Ruang lingkup dibatasi pada purwarupa tiga skenario terkontrol (tradisional, ZTA statis, ZTA adaptif+Random Forest) pada testbed container Docker untuk deteksi penyalahgunaan kredensial sah pasca-autentikasi pada trafik jaringan umum, tanpa mencakup federated learning, orkestrasi spesifik O-RAN, maupun evaluasi pada infrastruktur produksi.</w:t>
       </w:r>
     </w:p>
     <w:p>
@@ -1690,6 +1696,18 @@
       </w:r>
     </w:p>
     <w:p>
+      <w:pPr/>
+      <w:r>
+        <w:rPr>
+          <w:b/>
+        </w:rPr>
+        <w:t xml:space="preserve">Pembedaan Ruang Lingkup dari Studi Zero-Trust Berbasis mTLS (O-RAN) dan Kontribusi Tiga Skenario. </w:t>
+      </w:r>
+      <w:r>
+        <w:t>Penelitian mengenai ZTA adaptif berbasis machine learning telah berkembang (Pokhrel dkk., 2024; Rautaray, 2026; Jeong &amp; Yang, 2025), namun sebagian besar mengevaluasi skenario tunggal dan belum menyertakan perbandingan terkontrol tradisional vs ZTA statis vs ZTA adaptif beserta overhead performanya. Di sisi lain, pengujian keamanan berbasis container Docker (Leahy &amp; Thorpe, 2022) serta analisis kuantitatif overhead latency dan resource (Alayed dkk., 2026) menunjukkan perlunya testbed pembandu yang dapat diulang. Penelitian ini secara eksplisit membedakan diri dari studi Zero-Trust berbasis mTLS pada management plane O-RAN (antarmuka O1/O2/A1) yang berfokus pada penegakan identitas per-akses di domain telekomunikasi; kontribusi utama TA adalah purwarupa tiga skenario terkontrol pada testbed Docker untuk mendeteksi penyalahgunaan kredensial sah pasca-autentikasi, dengan evaluasi overhead (latency, RTT, jitter, throughput). Deteksi anomali dengan Random Forest pada trafik jaringan turut divalidasi oleh studi komparatif RF (Hakay &amp; Genç, 2026; Assiri, 2020), sehingga memperkuat pemilihan metode pada Skenario C.</w:t>
+      </w:r>
+    </w:p>
+    <w:p>
       <w:pPr>
         <w:spacing w:before="200" w:after="80"/>
       </w:pPr>
@@ -2357,6 +2375,60 @@
         <w:t>(2025), 'Zero trust security model implementation in microservices architectures using identity federation', arXiv:2511.04925.</w:t>
       </w:r>
     </w:p>
+    <w:p>
+      <w:pPr/>
+      <w:r>
+        <w:t>Rautaray, A., 'Intelligent adaptive authentication for zero-trust microservice architectures using AI-driven behavioral analytics,' Journal of Artificial Intelligence and Robotics, 2026.</w:t>
+      </w:r>
+    </w:p>
+    <w:p>
+      <w:pPr/>
+      <w:r>
+        <w:t>Alayed, W., Tahir, H. A., dan Ul Hassan, W., 'End-to-End Performance Analysis of an Intelligent Zero-Trust Framework for SDN: A Quantitative Evaluation of Latency and Overhead,' Electronics, vol. 15, no. 11, 2026.</w:t>
+      </w:r>
+    </w:p>
+    <w:p>
+      <w:pPr/>
+      <w:r>
+        <w:t>Leahy, D. dan Thorpe, C., 'Zero Trust Container Architecture (ZTCA),' in Proceedings of the International Conference on Cyber Warfare and Security, 2022.</w:t>
+      </w:r>
+    </w:p>
+    <w:p>
+      <w:pPr/>
+      <w:r>
+        <w:t>Jeong, E. dan Yang, D., 'A Trust Score-Based Access Control Model for Zero Trust Architecture: Design, Sensitivity Analysis, and Real-World Performance Evaluation,' Applied Sciences, vol. 15, no. 17, 2025.</w:t>
+      </w:r>
+    </w:p>
+    <w:p>
+      <w:pPr/>
+      <w:r>
+        <w:t>Hakay, C. B. dan Genç, S., 'Comparative Analysis of Random Forest and Artificial Neural Network Models for Network Traffic Anomaly Detection on the NSL-KDD Dataset,' Journal of Computational Optimization and Scientific Machine Learning, 2026.</w:t>
+      </w:r>
+    </w:p>
+    <w:p>
+      <w:pPr/>
+      <w:r>
+        <w:t>Assiri, A., 'Anomaly Classification Using Genetic Algorithm-based Random Forest Model for Network Attack Detection,' Computers, Materials &amp; Continua, 2020.</w:t>
+      </w:r>
+    </w:p>
+    <w:p>
+      <w:pPr/>
+      <w:r>
+        <w:t>'Leveraging Zero Trust Architectures and Blockchain Protocols to Prevent Credential Stuffing and Lateral Fraud Attacks in Enterprise Systems,' International Journal of Computer Applications Technology and Research, vol. 14, no. 8, 2025.</w:t>
+      </w:r>
+    </w:p>
+    <w:p>
+      <w:pPr/>
+      <w:r>
+        <w:t>Hernández, R. M., dkk., 'Adaptive Security Model for E-Learning Platforms Using Multi-Layered Anomaly Detection and Context-Aware Risk Assessment,' Journal of Internet Services and Information Security, 2026.</w:t>
+      </w:r>
+    </w:p>
+    <w:p>
+      <w:pPr/>
+      <w:r>
+        <w:t>Lilhore, U. K., dkk., 'SmartTrust: a hybrid deep learning framework for real-time threat detection in cloud environments using Zero-Trust Architecture,' Journal of Cloud Computing, 2025.</w:t>
+      </w:r>
+    </w:p>
     <w:sectPr>
       <w:pgSz w:w="12240" w:h="15840"/>
       <w:pgMar w:top="1440" w:right="1800" w:bottom="1440" w:left="1800" w:header="720" w:footer="720" w:gutter="0"/>

</xml_diff>